<commit_message>
Auto commit (2026-09-16 22:00) — 6 changes
Claude Code 세션 종료 시 자동 커밋.

Co-Authored-By: Claude <noreply@anthropic.com>
Claude-Session: https://claude.ai/code/982c969d-2ce3-4475-abba-0f7f053ce9a7
</commit_message>
<xml_diff>
--- a/projects/30_wolf_heir_triplets/Vigloo AI Drama Proposal_I'M CARRYING THE WOLF HEIR'S TRIPLETS_KR_CN.docx
+++ b/projects/30_wolf_heir_triplets/Vigloo AI Drama Proposal_I'M CARRYING THE WOLF HEIR'S TRIPLETS_KR_CN.docx
@@ -429,24 +429,24 @@
                 <w:rFonts w:ascii="Malgun Gothic" w:hAnsi="Malgun Gothic" w:eastAsia="Malgun Gothic"/>
                 <w:sz w:val="20"/>
               </w:rPr>
-              <w:t>현대 웨어울프 로맨스 (여성향)</w:t>
-            </w:r>
-          </w:p>
-          <w:p>
-            <w:r>
-              <w:rPr>
-                <w:rFonts w:ascii="Malgun Gothic" w:hAnsi="Malgun Gothic" w:eastAsia="Malgun Gothic"/>
-                <w:sz w:val="20"/>
-              </w:rPr>
-            </w:r>
-          </w:p>
-          <w:p>
-            <w:r>
-              <w:rPr>
-                <w:rFonts w:ascii="Malgun Gothic" w:hAnsi="Malgun Gothic" w:eastAsia="Malgun Gothic"/>
-                <w:sz w:val="20"/>
-              </w:rPr>
-              <w:t>现代狼人爱情 (女频)</w:t>
+              <w:t>어반 판타지 / 로맨스 (여성향)</w:t>
+            </w:r>
+          </w:p>
+          <w:p>
+            <w:r>
+              <w:rPr>
+                <w:rFonts w:ascii="Malgun Gothic" w:hAnsi="Malgun Gothic" w:eastAsia="Malgun Gothic"/>
+                <w:sz w:val="20"/>
+              </w:rPr>
+            </w:r>
+          </w:p>
+          <w:p>
+            <w:r>
+              <w:rPr>
+                <w:rFonts w:ascii="Malgun Gothic" w:hAnsi="Malgun Gothic" w:eastAsia="Malgun Gothic"/>
+                <w:sz w:val="20"/>
+              </w:rPr>
+              <w:t>都市奇幻 / 爱情 (女频)</w:t>
             </w:r>
           </w:p>
         </w:tc>

</xml_diff>

<commit_message>
Auto commit (2026-09-17 11:14) — 3 changes
Claude Code 세션 종료 시 자동 커밋.

Co-Authored-By: Claude <noreply@anthropic.com>
</commit_message>
<xml_diff>
--- a/projects/30_wolf_heir_triplets/Vigloo AI Drama Proposal_I'M CARRYING THE WOLF HEIR'S TRIPLETS_KR_CN.docx
+++ b/projects/30_wolf_heir_triplets/Vigloo AI Drama Proposal_I'M CARRYING THE WOLF HEIR'S TRIPLETS_KR_CN.docx
@@ -1219,92 +1219,58 @@
                 <w:rFonts w:ascii="Malgun Gothic" w:hAnsi="Malgun Gothic" w:eastAsia="Malgun Gothic"/>
                 <w:sz w:val="20"/>
               </w:rPr>
-              <w:t>늑대 피가 절반뿐이라 변신도 못 하고 팩에도 못 낀 울프리스 밀라 콜은, 할아버지 월터의 심장 수술비 80만 달러가 필요하다. 보름달 밤 밀라 앞에 쓰러진 알파 후계자 그레이슨 블레이크의 목에 200년 만에 처음 메이트 마크가 뜨고, 약에 취한 그레이슨은 밀라를 차 뒷좌석으로 끌어당긴다. 다음 날 그레이슨이 20만 달러를 내밀며 비웃자, 밀라는 처음이었다고 쏘아붙이고도 돈을 챙긴다. 클럽 밀실에서 순혈 늑대 둘에게 붙잡힌 밀라를 구한 그레이슨이 남은 60만 달러를 줄 테니 한 번 더 자자고 하자, 밀라는 마지막이라며 받아들인다. 두 달 뒤 팩 진료실에서 세쌍둥이를 가진 걸 안 밀라는 아이 아빠를 숨긴 채, 그레이슨의 어머니 다이애나에게 아이들을 지워 달라고 부탁한다. 그날 밤 그레이슨은 어머니에게서 80만 달러를 한 번에 낸 아가씨가 세쌍둥이를 지운다는 말을 듣고, 그 아가씨가 밀라이고 그 돈이 제 돈이라는 걸 알아 저택을 뛰쳐나간다.</w:t>
-            </w:r>
-          </w:p>
-          <w:p>
-            <w:r>
-              <w:rPr>
-                <w:rFonts w:ascii="Malgun Gothic" w:hAnsi="Malgun Gothic" w:eastAsia="Malgun Gothic"/>
-                <w:sz w:val="20"/>
-              </w:rPr>
-            </w:r>
-          </w:p>
-          <w:p>
-            <w:r>
-              <w:rPr>
-                <w:rFonts w:ascii="Malgun Gothic" w:hAnsi="Malgun Gothic" w:eastAsia="Malgun Gothic"/>
-                <w:sz w:val="20"/>
-              </w:rPr>
-              <w:t>그레이슨이 진료실에 닿았을 때 밀라는 이미 아이들을 낳기로 하고 집에 돌아간 뒤다. 집까지 찾아온 그레이슨은 임신을 왜 숨겼냐고 묻고, 아이들이 태어난 뒤 떠나고 싶으면 보내 주겠다는 계약 결혼을 청한다. 값이 300만 달러에서 800만 달러까지 오르는 동안 밀라는 아이들이 알파의 자식으로 살 수 있다는 것만 생각하고, 결혼을 비밀로 한다는 조건으로 받아들인다. 복원실에서는 그레이슨을 차지하려는 선임 복원사 바네사가 수습생 밀라에게 은 밴 문서를 떠넘기고, 뛰어든 그레이슨이 밀라를 감싸는 사이 2년 전 내기로 밀라를 만났던 부관장 이든이 밀라를 알아본다. 바네사의 말에 관장이 밀라와 바네사를 복원 대결에 세우고, 대결 전날 밤 그레이슨은 두 사람을 이어 주는 메이트 마크를 통해 밀라 몸속에 잠들어 있던 늑대의 힘을 깨워 준다. 밀라는 선임들도 손대지 못하던 문서를 되살려 이기고, 바네사는 복원실에서 쫓겨난다. 그레이슨의 정혼자 클레어 베넷이 고백하자 그레이슨이 임신한 아내가 있다고 답하고, 소식을 들은 다이애나는 며느리가 밀라인 줄 모른 채 집 10채와 차 5대, 8천만 달러를 내민다.</w:t>
-            </w:r>
-          </w:p>
-          <w:p>
-            <w:r>
-              <w:rPr>
-                <w:rFonts w:ascii="Malgun Gothic" w:hAnsi="Malgun Gothic" w:eastAsia="Malgun Gothic"/>
-                <w:sz w:val="20"/>
-              </w:rPr>
-            </w:r>
-          </w:p>
-          <w:p>
-            <w:r>
-              <w:rPr>
-                <w:rFonts w:ascii="Malgun Gothic" w:hAnsi="Malgun Gothic" w:eastAsia="Malgun Gothic"/>
-                <w:sz w:val="20"/>
-              </w:rPr>
-              <w:t>그레이슨의 일을 캐려는 클레어는 밀라에게 10만 달러짜리 가방을 안기며 베넷 저택의 제 생일 파티에 부른다. 파티에서 밀라의 목에 남은 자국을 본 이든이 매달리지만, 밀라는 언제 널 좋아한다고 했냐며 거절한다. 그 사이 클레어가 10만 달러를 걸고 그레이슨을 꼬드긴 울프리스를 찾자, 그레이슨은 클레어와 결혼할 생각이 없다고 못 박는다. 그때 들어선 클레어의 양아버지이자 베넷 팩 알파인 리처드 베넷은 밀라를 보고 죽은 아내를 떠올리고, 죽은 줄 알았던 친딸이 아직 살아 있을지 모른다고 생각한다. 혼인 약속을 묻는 리처드 베넷 앞에서도 그레이슨은 마음 둔 사람이 아니면 결혼하지 않겠다고 답하고, 밀라에게 계약은 잊고 결혼해 달라고 다시 청한다. 밀라가 받아들이는 순간 들어선 다이애나는, 둘이 이미 결혼했다는 말을 듣고서야 밀라가 며느리이고 세쌍둥이가 제 손주라는 걸 안다.</w:t>
-            </w:r>
-          </w:p>
-          <w:p>
-            <w:r>
-              <w:rPr>
-                <w:rFonts w:ascii="Malgun Gothic" w:hAnsi="Malgun Gothic" w:eastAsia="Malgun Gothic"/>
-                <w:sz w:val="20"/>
-              </w:rPr>
-            </w:r>
-          </w:p>
-          <w:p>
-            <w:r>
-              <w:rPr>
-                <w:rFonts w:ascii="Malgun Gothic" w:hAnsi="Malgun Gothic" w:eastAsia="Malgun Gothic"/>
-                <w:sz w:val="20"/>
-              </w:rPr>
-              <w:t>只有一半狼血、既不能变身也进不了狼群的无狼者米拉·科尔，急需80万美元给爷爷沃尔特做心脏手术。满月之夜，阿尔法继承人格雷森·布莱克倒在米拉面前，他脖子上浮现出200年来第一个伴侣印记，药劲上头的格雷森把米拉拽进了车后座。第二天，格雷森拿出20万美元嘲笑她，米拉回呛说那是她的第一次，但还是把钱收下了。米拉在俱乐部密室里被两个纯血狼抓住，格雷森救下她后，提出把剩下的60万美元给她，要她再跟他睡一次，米拉说这是最后一次，答应了。两个月后，米拉在狼群诊疗室得知自己怀了三胞胎，她瞒着孩子父亲是谁，求格雷森的母亲戴安娜帮她打掉孩子。当晚，格雷森听母亲说，有个一次性付清80万美元的姑娘要打掉三胞胎，他意识到那个姑娘就是米拉，那笔钱是他给的，立刻冲出了宅邸。</w:t>
-            </w:r>
-          </w:p>
-          <w:p>
-            <w:r>
-              <w:rPr>
-                <w:rFonts w:ascii="Malgun Gothic" w:hAnsi="Malgun Gothic" w:eastAsia="Malgun Gothic"/>
-                <w:sz w:val="20"/>
-              </w:rPr>
-            </w:r>
-          </w:p>
-          <w:p>
-            <w:r>
-              <w:rPr>
-                <w:rFonts w:ascii="Malgun Gothic" w:hAnsi="Malgun Gothic" w:eastAsia="Malgun Gothic"/>
-                <w:sz w:val="20"/>
-              </w:rPr>
-              <w:t>格雷森赶到诊疗室时，米拉已经决定生下孩子，回家去了。格雷森追到她家，问她为什么瞒着怀孕的事，并提出契约婚姻，条件是孩子出生后她想走就放她走。价码从300万美元一路涨到800万美元，米拉心里只想着孩子们能以阿尔法子女的身份活下去，最后以婚事保密为条件答应了。在古籍修复室，想把格雷森抢到手的资深修复师凡妮莎把浸了银粉的古文书硬塞给实习生米拉，格雷森冲进来护住米拉，就在这时，两年前因为打赌跟米拉交往过的副馆长伊森认出了米拉。馆长听了凡妮莎的话，让米拉和凡妮莎进行修复对决，对决前一晚，格雷森通过连接两人的伴侣印记，唤醒了米拉体内沉睡的狼的力量。米拉把连资深修复师们都没法下手的古文书修复好，赢了对决，凡妮莎被赶出了古籍修复室。格雷森的未婚妻克莱尔·贝内特向他表白，格雷森回答说自己已经有怀孕的妻子了，戴安娜听到消息，不知道儿媳就是米拉，拿出了10套房、5辆车和8000万美元。</w:t>
-            </w:r>
-          </w:p>
-          <w:p>
-            <w:r>
-              <w:rPr>
-                <w:rFonts w:ascii="Malgun Gothic" w:hAnsi="Malgun Gothic" w:eastAsia="Malgun Gothic"/>
-                <w:sz w:val="20"/>
-              </w:rPr>
-            </w:r>
-          </w:p>
-          <w:p>
-            <w:r>
-              <w:rPr>
-                <w:rFonts w:ascii="Malgun Gothic" w:hAnsi="Malgun Gothic" w:eastAsia="Malgun Gothic"/>
-                <w:sz w:val="20"/>
-              </w:rPr>
-              <w:t>克莱尔想打探格雷森的事，塞给米拉一个10万美元的包，邀请她来贝内特宅邸参加自己的生日派对。派对上，伊森看到米拉脖子上留下的痕迹，缠着她不放，米拉反问她什么时候说过喜欢他，拒绝了他。与此同时，克莱尔悬赏10万美元，要找出勾引格雷森的那个无狼者，格雷森直接把话说死，他没打算和克莱尔结婚。这时，克莱尔的养父、贝内特狼群的阿尔法理查德·贝内特走了进来，他看到米拉，想起了死去的妻子，心想以为早就死了的亲生女儿也许还活着。理查德·贝内特问起婚约，格雷森当着他的面也照样回答，不是自己心里的人就不结婚，接着又再次请求米拉忘掉契约，嫁给他。就在米拉答应的那一刻，戴安娜走了进来，听说两人早就结婚了，她这才知道米拉就是自己的儿媳，三胞胎是自己的孙子孙女。</w:t>
+              <w:t>늑대 피가 절반뿐이라 변신을 못 하는 울프리스 밀라는 할아버지 수술비 80만 달러 때문에 알파 후계자 그레이슨 블레이크와 두 밤을 보낸다. 그렇게 세쌍둥이를 가진 밀라는 아이 아빠를 숨기고 그레이슨의 어머니 다이애나에게 아이들을 지워 달라고 부탁한다. 어머니에게 그 얘기를 들은 그레이슨은 제 아이들인 걸 알고 뛰쳐나간다.</w:t>
+            </w:r>
+          </w:p>
+          <w:p>
+            <w:r>
+              <w:rPr>
+                <w:rFonts w:ascii="Malgun Gothic" w:hAnsi="Malgun Gothic" w:eastAsia="Malgun Gothic"/>
+                <w:sz w:val="20"/>
+              </w:rPr>
+            </w:r>
+          </w:p>
+          <w:p>
+            <w:r>
+              <w:rPr>
+                <w:rFonts w:ascii="Malgun Gothic" w:hAnsi="Malgun Gothic" w:eastAsia="Malgun Gothic"/>
+                <w:sz w:val="20"/>
+              </w:rPr>
+              <w:t>하지만 밀라는 이미 낳기로 했고, 그레이슨이 아이들이 태어나면 끝나는 비밀 계약 결혼을 청하자 받아들인다. 다이애나는 며느리인 줄 모르고 밀라 앞에서 아이 아빠를 욕한다. 밀라는 고문서 복원실의 복원 대결에서 선임 복원사를 이긴다. 밀라가 몰래 지켜보는 자리에서 그레이슨은 정혼자 클레어의 고백에 이미 결혼했다고 답하고, 밀라도 다시 매달리는 옛 남자 이든을 뿌리친다. 클레어의 양아버지 리처드 베넷은 밀라를 보고 죽은 친딸을 떠올린다. 리처드 베넷 앞에서 그레이슨은 클레어와 결혼하지 않겠다고 밝히고, 계약을 버리고 밀라에게 진짜로 청혼한다. 밀라가 받아들인 순간 들어온 다이애나는 그제야 밀라가 며느리이고 세쌍둥이가 손주인 걸 안다.</w:t>
+            </w:r>
+          </w:p>
+          <w:p>
+            <w:r>
+              <w:rPr>
+                <w:rFonts w:ascii="Malgun Gothic" w:hAnsi="Malgun Gothic" w:eastAsia="Malgun Gothic"/>
+                <w:sz w:val="20"/>
+              </w:rPr>
+            </w:r>
+          </w:p>
+          <w:p>
+            <w:r>
+              <w:rPr>
+                <w:rFonts w:ascii="Malgun Gothic" w:hAnsi="Malgun Gothic" w:eastAsia="Malgun Gothic"/>
+                <w:sz w:val="20"/>
+              </w:rPr>
+              <w:t>米拉只有一半狼血，没法变身，是个无狼者。为了爷爷80万美元的手术费，她和阿尔法继承人格雷森·布莱克睡了两晚。就这样怀上三胞胎的米拉瞒着孩子爸爸是谁，求格雷森的母亲戴安娜帮她把孩子打掉。格雷森从母亲那里听说了这件事，知道那是自己的孩子，冲了出去。</w:t>
+            </w:r>
+          </w:p>
+          <w:p>
+            <w:r>
+              <w:rPr>
+                <w:rFonts w:ascii="Malgun Gothic" w:hAnsi="Malgun Gothic" w:eastAsia="Malgun Gothic"/>
+                <w:sz w:val="20"/>
+              </w:rPr>
+            </w:r>
+          </w:p>
+          <w:p>
+            <w:r>
+              <w:rPr>
+                <w:rFonts w:ascii="Malgun Gothic" w:hAnsi="Malgun Gothic" w:eastAsia="Malgun Gothic"/>
+                <w:sz w:val="20"/>
+              </w:rPr>
+              <w:t>可米拉早就决定把孩子生下来了。格雷森提出一段孩子出生就结束的秘密契约婚姻，米拉答应了。戴安娜不知道米拉就是自己的儿媳，当着米拉的面骂孩子的爸爸。米拉在古籍修复室的修复对决中赢了资深修复师。米拉在一旁偷偷看着，格雷森面对未婚妻克莱尔的告白，说自己已经结婚了，米拉也甩开了又来纠缠的前男友伊森。克莱尔的养父理查德·贝内特看到米拉，想起了自己死去的亲生女儿。格雷森在理查德·贝内特面前表明不会娶克莱尔，又放弃契约，真正向米拉求婚。米拉答应的那一刻，戴安娜走了进来，这才知道米拉是她的儿媳，三胞胎是她的孙子孙女。</w:t>
             </w:r>
           </w:p>
         </w:tc>
@@ -2414,60 +2380,60 @@
                 <w:rFonts w:ascii="Malgun Gothic" w:hAnsi="Malgun Gothic" w:eastAsia="Malgun Gothic"/>
                 <w:sz w:val="20"/>
               </w:rPr>
-              <w:t>서브 남주 / 이름: 이든 (Ethan) / 나이: 20대 후반</w:t>
-            </w:r>
-          </w:p>
-          <w:p>
-            <w:r>
-              <w:rPr>
-                <w:rFonts w:ascii="Malgun Gothic" w:hAnsi="Malgun Gothic" w:eastAsia="Malgun Gothic"/>
-                <w:sz w:val="20"/>
-              </w:rPr>
-              <w:t>직업 / 배경: 유력한 팩 집안의 아들이자 고문서 복원실의 부관장. 2년 전 밀라가 클럽에서 일할 때 내기 때문에 밀라를 만났을 뿐이라고 친구들 앞에서 웃다가, 그 말을 밀라에게 들킨 옛 남자다.</w:t>
-            </w:r>
-          </w:p>
-          <w:p>
-            <w:r>
-              <w:rPr>
-                <w:rFonts w:ascii="Malgun Gothic" w:hAnsi="Malgun Gothic" w:eastAsia="Malgun Gothic"/>
-                <w:sz w:val="20"/>
-              </w:rPr>
-              <w:t>성격 및 특징: 수습생에게 은 밴 문서를 맡긴 일로 그레이슨에게 고개를 숙이다가, 그 수습생이 밀라라는 걸 알아보는 남자. 무료 구간에는 나오지 않는다. 유료 구간에서는 몇 년이나 밀라를 찾아다녔다며 술 한잔 하자고 붙잡고, 진실 게임에서 자기를 아껴 주던 여자에게 상처를 준 게 가장 큰 후회라고 말한다. 끝내 밀라의 목에 남은 자국을 보고 그 남자가 누구냐며 팔을 붙잡고, 네가 사랑하는 건 나 아니냐고 매달렸다가 언제 널 좋아한다고 했냐는 말을 듣는다.</w:t>
-            </w:r>
-          </w:p>
-          <w:p>
-            <w:r>
-              <w:rPr>
-                <w:rFonts w:ascii="Malgun Gothic" w:hAnsi="Malgun Gothic" w:eastAsia="Malgun Gothic"/>
-                <w:sz w:val="20"/>
-              </w:rPr>
-            </w:r>
-          </w:p>
-          <w:p>
-            <w:r>
-              <w:rPr>
-                <w:rFonts w:ascii="Malgun Gothic" w:hAnsi="Malgun Gothic" w:eastAsia="Malgun Gothic"/>
-                <w:sz w:val="20"/>
-              </w:rPr>
-              <w:t>男配 / 姓名: 伊森 (Ethan) / 年龄: 二十七八</w:t>
-            </w:r>
-          </w:p>
-          <w:p>
-            <w:r>
-              <w:rPr>
-                <w:rFonts w:ascii="Malgun Gothic" w:hAnsi="Malgun Gothic" w:eastAsia="Malgun Gothic"/>
-                <w:sz w:val="20"/>
-              </w:rPr>
-              <w:t>职业 / 背景: 有权势的狼群家族的儿子，古籍修复室副馆长。两年前米拉在俱乐部打工时，他在朋友面前笑着说自己跟米拉在一起只是因为打赌，结果这话被米拉听见了，是米拉的前男友。</w:t>
-            </w:r>
-          </w:p>
-          <w:p>
-            <w:r>
-              <w:rPr>
-                <w:rFonts w:ascii="Malgun Gothic" w:hAnsi="Malgun Gothic" w:eastAsia="Malgun Gothic"/>
-                <w:sz w:val="20"/>
-              </w:rPr>
-              <w:t>性格及特点: 因为让实习生处理浸了银粉的古文书而向格雷森低头认错时，认出那个实习生就是米拉的男人。免费段里不出场。付费段里，他说自己找了米拉好几年，拉着她要一起喝一杯，玩真心话游戏时，他说最后悔的就是伤害了那个真心对他好的女人。最后，他看到米拉脖子上留下的痕迹，抓住她的胳膊问那个男人是谁，缠着问她爱的难道不是自己，结果听到米拉反问她什么时候说过喜欢他。</w:t>
+              <w:t>서브 남주 / 이름: 이든 헤이스 (Ethan Hayes) / 나이: 20대 후반</w:t>
+            </w:r>
+          </w:p>
+          <w:p>
+            <w:r>
+              <w:rPr>
+                <w:rFonts w:ascii="Malgun Gothic" w:hAnsi="Malgun Gothic" w:eastAsia="Malgun Gothic"/>
+                <w:sz w:val="20"/>
+              </w:rPr>
+              <w:t>직업 / 배경: 유력한 헤이스 팩의 후계자이자 고문서 복원실의 부관장. 2년 전 밀라가 클럽에서 일할 때 내기 때문에 밀라를 만났을 뿐이라고 친구들 앞에서 웃다가, 그 말을 밀라에게 들킨 옛 남자다.</w:t>
+            </w:r>
+          </w:p>
+          <w:p>
+            <w:r>
+              <w:rPr>
+                <w:rFonts w:ascii="Malgun Gothic" w:hAnsi="Malgun Gothic" w:eastAsia="Malgun Gothic"/>
+                <w:sz w:val="20"/>
+              </w:rPr>
+              <w:t>성격 및 특징: 수습생에게 은 밴 문서를 맡긴 일로 그레이슨에게 고개를 숙이다가, 그 수습생이 밀라라는 걸 알아보는 남자. 유료 구간에서는 몇 년이나 밀라를 찾아다녔다며 술 한잔 하자고 붙잡고, 진실 게임에서 자기를 아껴 주던 여자에게 상처를 준 게 가장 큰 후회라고 말한다. 끝내 밀라의 목에 남은 자국을 보고 그 남자가 누구냐며 팔을 붙잡고, 네가 사랑하는 건 나 아니냐고 매달렸다가 언제 널 좋아한다고 했냐는 말을 듣는다.</w:t>
+            </w:r>
+          </w:p>
+          <w:p>
+            <w:r>
+              <w:rPr>
+                <w:rFonts w:ascii="Malgun Gothic" w:hAnsi="Malgun Gothic" w:eastAsia="Malgun Gothic"/>
+                <w:sz w:val="20"/>
+              </w:rPr>
+            </w:r>
+          </w:p>
+          <w:p>
+            <w:r>
+              <w:rPr>
+                <w:rFonts w:ascii="Malgun Gothic" w:hAnsi="Malgun Gothic" w:eastAsia="Malgun Gothic"/>
+                <w:sz w:val="20"/>
+              </w:rPr>
+              <w:t>男配 / 姓名: 伊森·海斯 (Ethan Hayes) / 年龄: 二十七八</w:t>
+            </w:r>
+          </w:p>
+          <w:p>
+            <w:r>
+              <w:rPr>
+                <w:rFonts w:ascii="Malgun Gothic" w:hAnsi="Malgun Gothic" w:eastAsia="Malgun Gothic"/>
+                <w:sz w:val="20"/>
+              </w:rPr>
+              <w:t>职业 / 背景: 有势力的海斯狼群的继承人，也是古籍修复室的副馆长。两年前米拉还在俱乐部打工时，他在朋友面前笑着说，自己跟米拉在一起只是因为打赌，结果这话被米拉听见了。他是米拉的前男友。</w:t>
+            </w:r>
+          </w:p>
+          <w:p>
+            <w:r>
+              <w:rPr>
+                <w:rFonts w:ascii="Malgun Gothic" w:hAnsi="Malgun Gothic" w:eastAsia="Malgun Gothic"/>
+                <w:sz w:val="20"/>
+              </w:rPr>
+              <w:t>性格及特点: 一个因为把浸了银粉的古文书交给实习生而向格雷森低头，随后认出那个实习生就是米拉的男人。付费段里，他说自己找了米拉好几年，拉住她要一起喝一杯；在真心话游戏里，他说自己最后悔的，是伤害了那个一直珍惜他的女人。最后，他看到米拉脖子上留下的痕迹，抓住她的胳膊问那个男人是谁，缠着问她爱的难道不是自己，结果米拉反问他，自己什么时候说过喜欢他。</w:t>
             </w:r>
           </w:p>
         </w:tc>
@@ -2987,78 +2953,42 @@
                 <w:rFonts w:ascii="Malgun Gothic" w:hAnsi="Malgun Gothic" w:eastAsia="Malgun Gothic"/>
                 <w:sz w:val="20"/>
               </w:rPr>
-              <w:t>1. 13화의 계약 결혼은 아이들이 태어난 뒤 밀라가 원하면 끝낼 수 있는 조건이고, 49화에 그레이슨이 계약은 잊으라며 다시 청혼한다.</w:t>
-            </w:r>
-          </w:p>
-          <w:p>
-            <w:r>
-              <w:rPr>
-                <w:rFonts w:ascii="Malgun Gothic" w:hAnsi="Malgun Gothic" w:eastAsia="Malgun Gothic"/>
-                <w:sz w:val="20"/>
-              </w:rPr>
-              <w:t>2. 다이애나는 50화에서야 밀라가 제 며느리이고 세쌍둥이가 제 손주라는 걸 안다.</w:t>
-            </w:r>
-          </w:p>
-          <w:p>
-            <w:r>
-              <w:rPr>
-                <w:rFonts w:ascii="Malgun Gothic" w:hAnsi="Malgun Gothic" w:eastAsia="Malgun Gothic"/>
-                <w:sz w:val="20"/>
-              </w:rPr>
-              <w:t>3. 26화에서 밀라는 선임들도 손대지 못하던 은 밴 문서를 제 손으로 되살려 바네사와의 대결에서 이긴다.</w:t>
-            </w:r>
-          </w:p>
-          <w:p>
-            <w:r>
-              <w:rPr>
-                <w:rFonts w:ascii="Malgun Gothic" w:hAnsi="Malgun Gothic" w:eastAsia="Malgun Gothic"/>
-                <w:sz w:val="20"/>
-              </w:rPr>
-              <w:t>4. 47화에서 리처드 베넷은 밀라를 보고 죽은 아내를 떠올리고, 죽은 줄 알았던 친딸이 살아 있을지 모른다고 생각한다.</w:t>
-            </w:r>
-          </w:p>
-          <w:p>
-            <w:r>
-              <w:rPr>
-                <w:rFonts w:ascii="Malgun Gothic" w:hAnsi="Malgun Gothic" w:eastAsia="Malgun Gothic"/>
-                <w:sz w:val="20"/>
-              </w:rPr>
-            </w:r>
-          </w:p>
-          <w:p>
-            <w:r>
-              <w:rPr>
-                <w:rFonts w:ascii="Malgun Gothic" w:hAnsi="Malgun Gothic" w:eastAsia="Malgun Gothic"/>
-                <w:sz w:val="20"/>
-              </w:rPr>
-              <w:t>1. 第13集的契约婚姻，条件是孩子出生后米拉想结束就能结束，第49集格雷森让她忘掉契约，再次向她求婚。</w:t>
-            </w:r>
-          </w:p>
-          <w:p>
-            <w:r>
-              <w:rPr>
-                <w:rFonts w:ascii="Malgun Gothic" w:hAnsi="Malgun Gothic" w:eastAsia="Malgun Gothic"/>
-                <w:sz w:val="20"/>
-              </w:rPr>
-              <w:t>2. 戴安娜直到第50集才知道米拉是自己的儿媳，三胞胎是自己的孙子孙女。</w:t>
-            </w:r>
-          </w:p>
-          <w:p>
-            <w:r>
-              <w:rPr>
-                <w:rFonts w:ascii="Malgun Gothic" w:hAnsi="Malgun Gothic" w:eastAsia="Malgun Gothic"/>
-                <w:sz w:val="20"/>
-              </w:rPr>
-              <w:t>3. 第26集，米拉亲手把连资深修复师们都没法下手的浸了银粉的古文书修复好，在和凡妮莎的修复对决中获胜。</w:t>
-            </w:r>
-          </w:p>
-          <w:p>
-            <w:r>
-              <w:rPr>
-                <w:rFonts w:ascii="Malgun Gothic" w:hAnsi="Malgun Gothic" w:eastAsia="Malgun Gothic"/>
-                <w:sz w:val="20"/>
-              </w:rPr>
-              <w:t>4. 第47集，理查德·贝内特看到米拉，想起死去的妻子，心想以为早就死了的亲生女儿也许还活着。</w:t>
+              <w:t>1. 계약 결혼은 아이들이 태어나면 끝나기로 한 약속이고, 마지막에 그레이슨이 계약을 버리고 진짜로 청혼한다.</w:t>
+            </w:r>
+          </w:p>
+          <w:p>
+            <w:r>
+              <w:rPr>
+                <w:rFonts w:ascii="Malgun Gothic" w:hAnsi="Malgun Gothic" w:eastAsia="Malgun Gothic"/>
+                <w:sz w:val="20"/>
+              </w:rPr>
+              <w:t>2. 다이애나는 마지막 화에 가서야 밀라가 제 며느리이고 세쌍둥이가 제 손주라는 걸 안다.</w:t>
+            </w:r>
+          </w:p>
+          <w:p>
+            <w:r>
+              <w:rPr>
+                <w:rFonts w:ascii="Malgun Gothic" w:hAnsi="Malgun Gothic" w:eastAsia="Malgun Gothic"/>
+                <w:sz w:val="20"/>
+              </w:rPr>
+            </w:r>
+          </w:p>
+          <w:p>
+            <w:r>
+              <w:rPr>
+                <w:rFonts w:ascii="Malgun Gothic" w:hAnsi="Malgun Gothic" w:eastAsia="Malgun Gothic"/>
+                <w:sz w:val="20"/>
+              </w:rPr>
+              <w:t>1. 契约婚姻约定孩子出生后就结束，最后格雷森放弃契约，真正求婚。</w:t>
+            </w:r>
+          </w:p>
+          <w:p>
+            <w:r>
+              <w:rPr>
+                <w:rFonts w:ascii="Malgun Gothic" w:hAnsi="Malgun Gothic" w:eastAsia="Malgun Gothic"/>
+                <w:sz w:val="20"/>
+              </w:rPr>
+              <w:t>2. 戴安娜直到最后一集才知道，米拉是她的儿媳，三胞胎是她的孙子孙女。</w:t>
             </w:r>
           </w:p>
         </w:tc>
@@ -3110,96 +3040,42 @@
                 <w:rFonts w:ascii="Malgun Gothic" w:hAnsi="Malgun Gothic" w:eastAsia="Malgun Gothic"/>
                 <w:sz w:val="20"/>
               </w:rPr>
-              <w:t>- 밀라는 50화까지 늑대로 변신하지 않는다.</w:t>
-            </w:r>
-          </w:p>
-          <w:p>
-            <w:r>
-              <w:rPr>
-                <w:rFonts w:ascii="Malgun Gothic" w:hAnsi="Malgun Gothic" w:eastAsia="Malgun Gothic"/>
-                <w:sz w:val="20"/>
-              </w:rPr>
-              <w:t>- 아이들은 50화까지 태어나지 않는다.</w:t>
-            </w:r>
-          </w:p>
-          <w:p>
-            <w:r>
-              <w:rPr>
-                <w:rFonts w:ascii="Malgun Gothic" w:hAnsi="Malgun Gothic" w:eastAsia="Malgun Gothic"/>
-                <w:sz w:val="20"/>
-              </w:rPr>
-              <w:t>- 밀라가 누구의 딸인지는 50화까지 밝히지 않는다.</w:t>
-            </w:r>
-          </w:p>
-          <w:p>
-            <w:r>
-              <w:rPr>
-                <w:rFonts w:ascii="Malgun Gothic" w:hAnsi="Malgun Gothic" w:eastAsia="Malgun Gothic"/>
-                <w:sz w:val="20"/>
-              </w:rPr>
-              <w:t>- 레퍼런스 원작의 엘프·마법·왕국·왕자·유니콘·마법 두루마리 설정과 원작 인물 이름은 대본에 쓰지 않는다.</w:t>
-            </w:r>
-          </w:p>
-          <w:p>
-            <w:r>
-              <w:rPr>
-                <w:rFonts w:ascii="Malgun Gothic" w:hAnsi="Malgun Gothic" w:eastAsia="Malgun Gothic"/>
-                <w:sz w:val="20"/>
-              </w:rPr>
-              <w:t>- 대본에 새 설정 이름, 어려운 말, 돌려 말하는 대사를 넣지 않는다.</w:t>
-            </w:r>
-          </w:p>
-          <w:p>
-            <w:r>
-              <w:rPr>
-                <w:rFonts w:ascii="Malgun Gothic" w:hAnsi="Malgun Gothic" w:eastAsia="Malgun Gothic"/>
-                <w:sz w:val="20"/>
-              </w:rPr>
-            </w:r>
-          </w:p>
-          <w:p>
-            <w:r>
-              <w:rPr>
-                <w:rFonts w:ascii="Malgun Gothic" w:hAnsi="Malgun Gothic" w:eastAsia="Malgun Gothic"/>
-                <w:sz w:val="20"/>
-              </w:rPr>
-              <w:t>- 直到第50集，米拉都不变身成狼。</w:t>
-            </w:r>
-          </w:p>
-          <w:p>
-            <w:r>
-              <w:rPr>
-                <w:rFonts w:ascii="Malgun Gothic" w:hAnsi="Malgun Gothic" w:eastAsia="Malgun Gothic"/>
-                <w:sz w:val="20"/>
-              </w:rPr>
-              <w:t>- 直到第50集，孩子们都不出生。</w:t>
-            </w:r>
-          </w:p>
-          <w:p>
-            <w:r>
-              <w:rPr>
-                <w:rFonts w:ascii="Malgun Gothic" w:hAnsi="Malgun Gothic" w:eastAsia="Malgun Gothic"/>
-                <w:sz w:val="20"/>
-              </w:rPr>
-              <w:t>- 直到第50集，都不揭晓米拉是谁的女儿。</w:t>
-            </w:r>
-          </w:p>
-          <w:p>
-            <w:r>
-              <w:rPr>
-                <w:rFonts w:ascii="Malgun Gothic" w:hAnsi="Malgun Gothic" w:eastAsia="Malgun Gothic"/>
-                <w:sz w:val="20"/>
-              </w:rPr>
-              <w:t>- 参考原作里的精灵、魔法、王国、王子、独角兽、魔法卷轴设定和原作人物名字，不写进剧本。</w:t>
-            </w:r>
-          </w:p>
-          <w:p>
-            <w:r>
-              <w:rPr>
-                <w:rFonts w:ascii="Malgun Gothic" w:hAnsi="Malgun Gothic" w:eastAsia="Malgun Gothic"/>
-                <w:sz w:val="20"/>
-              </w:rPr>
-              <w:t>- 剧本里不加新的设定名称、难懂的词和拐弯抹角的台词。</w:t>
+              <w:t>- 원작의 엘프·마법·왕국 설정과 원작 인물 이름은 쓰지 않는다.</w:t>
+            </w:r>
+          </w:p>
+          <w:p>
+            <w:r>
+              <w:rPr>
+                <w:rFonts w:ascii="Malgun Gothic" w:hAnsi="Malgun Gothic" w:eastAsia="Malgun Gothic"/>
+                <w:sz w:val="20"/>
+              </w:rPr>
+              <w:t>- 대사는 한 번에 알아듣게 쓰고, 돌려 말하거나 어려운 말을 쓰지 않는다.</w:t>
+            </w:r>
+          </w:p>
+          <w:p>
+            <w:r>
+              <w:rPr>
+                <w:rFonts w:ascii="Malgun Gothic" w:hAnsi="Malgun Gothic" w:eastAsia="Malgun Gothic"/>
+                <w:sz w:val="20"/>
+              </w:rPr>
+            </w:r>
+          </w:p>
+          <w:p>
+            <w:r>
+              <w:rPr>
+                <w:rFonts w:ascii="Malgun Gothic" w:hAnsi="Malgun Gothic" w:eastAsia="Malgun Gothic"/>
+                <w:sz w:val="20"/>
+              </w:rPr>
+              <w:t>- 不使用原作的精灵、魔法、王国设定，也不使用原作人物的名字。</w:t>
+            </w:r>
+          </w:p>
+          <w:p>
+            <w:r>
+              <w:rPr>
+                <w:rFonts w:ascii="Malgun Gothic" w:hAnsi="Malgun Gothic" w:eastAsia="Malgun Gothic"/>
+                <w:sz w:val="20"/>
+              </w:rPr>
+              <w:t>- 台词要写得一听就懂，不绕弯子，不用难懂的词。</w:t>
             </w:r>
           </w:p>
         </w:tc>

</xml_diff>